<commit_message>
v438.0.0: Werkstätten und Aktenqualität vertiefen
</commit_message>
<xml_diff>
--- a/testakten/kriegsdienstverweigerung-gewissensantrag-berlin-2026/docx/anschreiben-bapersbw.docx
+++ b/testakten/kriegsdienstverweigerung-gewissensantrag-berlin-2026/docx/anschreiben-bapersbw.docx
@@ -4,32 +4,314 @@
   <w:body>
     <w:p>
       <w:pPr>
-        <w:pStyle w:val="Title"/>
+        <w:spacing w:after="160"/>
+        <w:pBdr>
+          <w:bottom w:val="single" w:sz="4" w:space="2" w:color="A9B7BF"/>
+        </w:pBdr>
       </w:pPr>
       <w:r>
-        <w:t>Antrag auf Anerkennung als Kriegsdienstverweigerer</w:t>
+        <w:rPr>
+          <w:rFonts w:ascii="Arial" w:hAnsi="Arial"/>
+          <w:color w:val="5A5A5A"/>
+          <w:sz w:val="16"/>
+        </w:rPr>
+        <w:t>Malte Eberhard Rabenow · Wollankstraße 118 · 13187 Berlin</w:t>
+      </w:r>
+    </w:p>
+    <w:p>
+      <w:pPr>
+        <w:spacing w:after="0"/>
+      </w:pPr>
+      <w:r>
+        <w:t>Bundesamt für das Personalmanagement der Bundeswehr</w:t>
+      </w:r>
+    </w:p>
+    <w:p>
+      <w:pPr>
+        <w:spacing w:after="0"/>
+      </w:pPr>
+      <w:r>
+        <w:t>Wehrersatzbehörde</w:t>
+      </w:r>
+    </w:p>
+    <w:p>
+      <w:pPr>
+        <w:spacing w:after="0"/>
+      </w:pPr>
+      <w:r>
+        <w:t>Militärringstraße 1000</w:t>
+      </w:r>
+    </w:p>
+    <w:p>
+      <w:pPr>
+        <w:spacing w:after="0"/>
+      </w:pPr>
+      <w:r>
+        <w:t>50737 Köln</w:t>
+      </w:r>
+    </w:p>
+    <w:p>
+      <w:pPr>
+        <w:spacing w:before="200"/>
+        <w:jc w:val="right"/>
+      </w:pPr>
+      <w:r>
+        <w:t>Berlin, 5. Juni 2026</w:t>
+      </w:r>
+    </w:p>
+    <w:tbl>
+      <w:tblPr>
+        <w:tblW w:type="auto" w:w="0"/>
+        <w:jc w:val="left"/>
+        <w:tblLayout w:type="fixed"/>
+        <w:tblLook w:firstColumn="1" w:firstRow="1" w:lastColumn="0" w:lastRow="0" w:noHBand="0" w:noVBand="1" w:val="04A0"/>
+      </w:tblPr>
+      <w:tblGrid>
+        <w:gridCol w:w="4649"/>
+        <w:gridCol w:w="4649"/>
+      </w:tblGrid>
+      <w:tr>
+        <w:tc>
+          <w:tcPr>
+            <w:tcW w:type="dxa" w:w="1757"/>
+            <w:vAlign w:val="center"/>
+            <w:tcMar>
+              <w:top w:w="80" w:type="dxa"/>
+              <w:start w:w="100" w:type="dxa"/>
+              <w:bottom w:w="80" w:type="dxa"/>
+              <w:end w:w="100" w:type="dxa"/>
+            </w:tcMar>
+            <w:shd w:fill="EAF0F3"/>
+          </w:tcPr>
+          <w:p>
+            <w:pPr>
+              <w:spacing w:after="0"/>
+            </w:pPr>
+            <w:r>
+              <w:rPr>
+                <w:rFonts w:ascii="Arial" w:hAnsi="Arial"/>
+                <w:b/>
+                <w:sz w:val="18"/>
+              </w:rPr>
+              <w:t>Betreff</w:t>
+            </w:r>
+          </w:p>
+        </w:tc>
+        <w:tc>
+          <w:tcPr>
+            <w:tcW w:type="dxa" w:w="7030"/>
+            <w:vAlign w:val="center"/>
+            <w:tcMar>
+              <w:top w:w="80" w:type="dxa"/>
+              <w:start w:w="100" w:type="dxa"/>
+              <w:bottom w:w="80" w:type="dxa"/>
+              <w:end w:w="100" w:type="dxa"/>
+            </w:tcMar>
+          </w:tcPr>
+          <w:p>
+            <w:pPr>
+              <w:spacing w:after="0"/>
+            </w:pPr>
+            <w:r>
+              <w:rPr>
+                <w:rFonts w:ascii="Arial" w:hAnsi="Arial"/>
+                <w:b w:val="0"/>
+                <w:sz w:val="18"/>
+              </w:rPr>
+              <w:t>Antrag auf Anerkennung als Kriegsdienstverweigerer aus Gewissensgründen</w:t>
+            </w:r>
+          </w:p>
+        </w:tc>
+      </w:tr>
+      <w:tr>
+        <w:tc>
+          <w:tcPr>
+            <w:tcW w:type="dxa" w:w="1757"/>
+            <w:vAlign w:val="center"/>
+            <w:tcMar>
+              <w:top w:w="80" w:type="dxa"/>
+              <w:start w:w="100" w:type="dxa"/>
+              <w:bottom w:w="80" w:type="dxa"/>
+              <w:end w:w="100" w:type="dxa"/>
+            </w:tcMar>
+            <w:shd w:fill="EAF0F3"/>
+          </w:tcPr>
+          <w:p>
+            <w:pPr>
+              <w:spacing w:after="0"/>
+            </w:pPr>
+            <w:r>
+              <w:rPr>
+                <w:rFonts w:ascii="Arial" w:hAnsi="Arial"/>
+                <w:b/>
+                <w:sz w:val="18"/>
+              </w:rPr>
+              <w:t>Antragsteller</w:t>
+            </w:r>
+          </w:p>
+        </w:tc>
+        <w:tc>
+          <w:tcPr>
+            <w:tcW w:type="dxa" w:w="7030"/>
+            <w:vAlign w:val="center"/>
+            <w:tcMar>
+              <w:top w:w="80" w:type="dxa"/>
+              <w:start w:w="100" w:type="dxa"/>
+              <w:bottom w:w="80" w:type="dxa"/>
+              <w:end w:w="100" w:type="dxa"/>
+            </w:tcMar>
+          </w:tcPr>
+          <w:p>
+            <w:pPr>
+              <w:spacing w:after="0"/>
+            </w:pPr>
+            <w:r>
+              <w:rPr>
+                <w:rFonts w:ascii="Arial" w:hAnsi="Arial"/>
+                <w:b w:val="0"/>
+                <w:sz w:val="18"/>
+              </w:rPr>
+              <w:t>Malte Eberhard Rabenow, geboren am 14.09.1998</w:t>
+            </w:r>
+          </w:p>
+        </w:tc>
+      </w:tr>
+      <w:tr>
+        <w:tc>
+          <w:tcPr>
+            <w:tcW w:type="dxa" w:w="1757"/>
+            <w:vAlign w:val="center"/>
+            <w:tcMar>
+              <w:top w:w="80" w:type="dxa"/>
+              <w:start w:w="100" w:type="dxa"/>
+              <w:bottom w:w="80" w:type="dxa"/>
+              <w:end w:w="100" w:type="dxa"/>
+            </w:tcMar>
+            <w:shd w:fill="EAF0F3"/>
+          </w:tcPr>
+          <w:p>
+            <w:pPr>
+              <w:spacing w:after="0"/>
+            </w:pPr>
+            <w:r>
+              <w:rPr>
+                <w:rFonts w:ascii="Arial" w:hAnsi="Arial"/>
+                <w:b/>
+                <w:sz w:val="18"/>
+              </w:rPr>
+              <w:t>Kontakt</w:t>
+            </w:r>
+          </w:p>
+        </w:tc>
+        <w:tc>
+          <w:tcPr>
+            <w:tcW w:type="dxa" w:w="7030"/>
+            <w:vAlign w:val="center"/>
+            <w:tcMar>
+              <w:top w:w="80" w:type="dxa"/>
+              <w:start w:w="100" w:type="dxa"/>
+              <w:bottom w:w="80" w:type="dxa"/>
+              <w:end w:w="100" w:type="dxa"/>
+            </w:tcMar>
+          </w:tcPr>
+          <w:p>
+            <w:pPr>
+              <w:spacing w:after="0"/>
+            </w:pPr>
+            <w:r>
+              <w:rPr>
+                <w:rFonts w:ascii="Arial" w:hAnsi="Arial"/>
+                <w:b w:val="0"/>
+                <w:sz w:val="18"/>
+              </w:rPr>
+              <w:t>malte.rabenow@stadtpost-berlin.de · 030 4478 2196</w:t>
+            </w:r>
+          </w:p>
+        </w:tc>
+      </w:tr>
+    </w:tbl>
+    <w:p>
+      <w:pPr>
+        <w:spacing w:after="0"/>
+      </w:pPr>
+    </w:p>
+    <w:p>
+      <w:r>
+        <w:t>Sehr geehrte Damen und Herren,</w:t>
       </w:r>
     </w:p>
     <w:p>
       <w:r>
-        <w:t>Bundesamt für das Personalmanagement der Bundeswehr - Wehrersatzbehörde -</w:t>
+        <w:t>hiermit beantrage ich die Anerkennung als Kriegsdienstverweigerer. Ich berufe mich auf mein Grundrecht aus Artikel 4 Absatz 3 Satz 1 des Grundgesetzes. Der Dienst mit der Waffe ist für mich mit einer verbindlichen Gewissensentscheidung unvereinbar.</w:t>
       </w:r>
     </w:p>
     <w:p>
       <w:r>
-        <w:t>Hiermit beantrage ich die Anerkennung als Kriegsdienstverweigerer. Ich berufe mich auf Art. 4 Abs. 3 Satz 1 GG.</w:t>
+        <w:t>Ich bin deutscher Staatsangehöriger, ungedient und am 14.09.1998 geboren. Eine Einberufung oder Musterungsaufforderung liegt mir derzeit nicht vor. Ich bitte um Registrierung meines Antrags und um Prüfung der für meinen Jahrgang vorgesehenen Weiterleitung an das Bundesamt für Familie und zivilgesellschaftliche Aufgaben.</w:t>
       </w:r>
     </w:p>
     <w:p>
       <w:r>
-        <w:t>Beigefügt sind Lebenslauf und persönliche Gewissensbegründung. Bitte bestätigen Sie Eingang, Aktenzeichen und Weiterleitung.</w:t>
+        <w:t>Meine persönliche Begründung beschreibt die Entwicklung dieser Entscheidung anhand konkreter biografischer Erlebnisse. Sie richtet sich nicht gegen den Staat oder gegen jede Form gesellschaftlicher Dienstleistung. Ich bin bereit, zivile Pflichten zu übernehmen; ausgeschlossen ist für mich der Einsatz einer Waffe gegen Menschen.</w:t>
+      </w:r>
+    </w:p>
+    <w:p>
+      <w:r>
+        <w:t>Bitte bestätigen Sie schriftlich das Eingangsdatum, die vergebene Vorgangsnummer und die Weiterleitung. Sollten Unterlagen fehlen oder in einer anderen Form benötigt werden, bitte ich um einen konkreten Hinweis mit angemessener Frist. Für Rückfragen bin ich unter den oben angegebenen Kontaktdaten erreichbar.</w:t>
+      </w:r>
+    </w:p>
+    <w:p>
+      <w:r>
+        <w:t>Mit freundlichen Grüßen</w:t>
+      </w:r>
+    </w:p>
+    <w:p>
+      <w:pPr>
+        <w:spacing w:before="280"/>
+      </w:pPr>
+      <w:r>
+        <w:t>Malte Eberhard Rabenow</w:t>
+      </w:r>
+    </w:p>
+    <w:p>
+      <w:pPr>
+        <w:pStyle w:val="Heading1"/>
+      </w:pPr>
+      <w:r>
+        <w:t>Anlagen</w:t>
+      </w:r>
+    </w:p>
+    <w:p>
+      <w:pPr>
+        <w:spacing w:after="60"/>
+        <w:ind w:left="227"/>
+      </w:pPr>
+      <w:r>
+        <w:t>1. Persönliche Gewissensbegründung, 7 Seiten</w:t>
+      </w:r>
+    </w:p>
+    <w:p>
+      <w:pPr>
+        <w:spacing w:after="60"/>
+        <w:ind w:left="227"/>
+      </w:pPr>
+      <w:r>
+        <w:t>2. Tabellarischer Lebenslauf, 3 Seiten</w:t>
+      </w:r>
+    </w:p>
+    <w:p>
+      <w:pPr>
+        <w:spacing w:after="60"/>
+        <w:ind w:left="227"/>
+      </w:pPr>
+      <w:r>
+        <w:t>3. Kopie des Personalausweises, Vorder- und Rückseite</w:t>
       </w:r>
     </w:p>
     <w:sectPr>
-      <w:headerReference w:type="default" r:id="rId9"/>
-      <w:footerReference w:type="default" r:id="rId10"/>
-      <w:pgSz w:w="12240" w:h="15840"/>
-      <w:pgMar w:top="1440" w:right="1800" w:bottom="1440" w:left="1800" w:header="680" w:footer="567" w:gutter="0"/>
+      <w:footerReference w:type="default" r:id="rId9"/>
+      <w:pgSz w:w="11906" w:h="16838"/>
+      <w:pgMar w:top="1020" w:right="1247" w:bottom="1020" w:left="1361" w:header="720" w:footer="720" w:gutter="0"/>
       <w:cols w:space="720"/>
       <w:docGrid w:linePitch="360"/>
     </w:sectPr>
@@ -42,84 +324,28 @@
   <w:p>
     <w:pPr>
       <w:pStyle w:val="Footer"/>
-      <w:tabs>
-        <w:tab w:pos="9071" w:val="right"/>
-      </w:tabs>
-      <w:jc w:val="left"/>
+      <w:jc w:val="center"/>
     </w:pPr>
     <w:r>
       <w:rPr>
-        <w:rFonts w:ascii="Times New Roman" w:hAnsi="Times New Roman"/>
-        <w:color w:val="6B6B66"/>
+        <w:rFonts w:ascii="Arial" w:hAnsi="Arial"/>
+        <w:color w:val="646464"/>
         <w:sz w:val="16"/>
       </w:rPr>
+      <w:t xml:space="preserve">Malte Eberhard Rabenow · Antrag vom 05.06.2026 · Seite </w:t>
     </w:r>
     <w:r>
       <w:rPr>
-        <w:rFonts w:ascii="Times New Roman" w:hAnsi="Times New Roman"/>
-        <w:color w:val="6B6B66"/>
-        <w:sz w:val="16"/>
-      </w:rPr>
-      <w:t>Bundesamt für das Personalmanagement der Bundeswehr</w:t>
-    </w:r>
-    <w:r>
-      <w:rPr>
-        <w:rFonts w:ascii="Times New Roman" w:hAnsi="Times New Roman"/>
-        <w:color w:val="6B6B66"/>
-        <w:sz w:val="16"/>
-      </w:rPr>
-      <w:tab/>
-      <w:t xml:space="preserve">Seite </w:t>
-    </w:r>
-    <w:r>
-      <w:rPr>
-        <w:rFonts w:ascii="Times New Roman" w:hAnsi="Times New Roman"/>
-        <w:color w:val="6B6B66"/>
-        <w:sz w:val="16"/>
+        <w:rFonts w:ascii="Arial" w:hAnsi="Arial"/>
       </w:rPr>
       <w:fldChar w:fldCharType="begin"/>
       <w:instrText xml:space="preserve"> PAGE </w:instrText>
+      <w:fldChar w:fldCharType="separate"/>
+      <w:t>1</w:t>
       <w:fldChar w:fldCharType="end"/>
     </w:r>
   </w:p>
 </w:ftr>
-</file>
-
-<file path=word/header1.xml><?xml version="1.0" encoding="utf-8"?>
-<w:hdr xmlns:m="http://schemas.openxmlformats.org/officeDocument/2006/math" xmlns:mc="http://schemas.openxmlformats.org/markup-compatibility/2006" xmlns:mo="http://schemas.microsoft.com/office/mac/office/2008/main" xmlns:mv="urn:schemas-microsoft-com:mac:vml" xmlns:o="urn:schemas-microsoft-com:office:office" xmlns:r="http://schemas.openxmlformats.org/officeDocument/2006/relationships" xmlns:v="urn:schemas-microsoft-com:vml" xmlns:w10="urn:schemas-microsoft-com:office:word" xmlns:w14="http://schemas.microsoft.com/office/word/2010/wordml" xmlns:w="http://schemas.openxmlformats.org/wordprocessingml/2006/main" xmlns:wne="http://schemas.microsoft.com/office/word/2006/wordml" xmlns:wp14="http://schemas.microsoft.com/office/word/2010/wordprocessingDrawing" xmlns:wp="http://schemas.openxmlformats.org/drawingml/2006/wordprocessingDrawing" xmlns:wpc="http://schemas.microsoft.com/office/word/2010/wordprocessingCanvas" xmlns:wpg="http://schemas.microsoft.com/office/word/2010/wordprocessingGroup" xmlns:wpi="http://schemas.microsoft.com/office/word/2010/wordprocessingInk" xmlns:wps="http://schemas.microsoft.com/office/word/2010/wordprocessingShape" mc:Ignorable="w14 wp14">
-  <w:p>
-    <w:pPr>
-      <w:pStyle w:val="Header"/>
-      <w:jc w:val="left"/>
-    </w:pPr>
-    <w:r/>
-    <w:r>
-      <w:rPr>
-        <w:rFonts w:ascii="Times New Roman" w:hAnsi="Times New Roman"/>
-        <w:b/>
-        <w:color w:val="3B3F45"/>
-        <w:sz w:val="24"/>
-      </w:rPr>
-      <w:t>Bundesamt für das Personalmanagement der Bundeswehr</w:t>
-    </w:r>
-  </w:p>
-  <w:p>
-    <w:pPr>
-      <w:jc w:val="left"/>
-      <w:pBdr>
-        <w:bottom w:val="single" w:sz="6" w:space="2" w:color="3B3F45"/>
-      </w:pBdr>
-    </w:pPr>
-    <w:r>
-      <w:rPr>
-        <w:rFonts w:ascii="Times New Roman" w:hAnsi="Times New Roman"/>
-        <w:color w:val="6B6B66"/>
-        <w:sz w:val="16"/>
-      </w:rPr>
-      <w:t>Behörde</w:t>
-    </w:r>
-  </w:p>
-</w:hdr>
 </file>
 
 <file path=word/numbering.xml><?xml version="1.0" encoding="utf-8"?>
@@ -485,6 +711,14 @@
     <w:name w:val="Normal"/>
     <w:qFormat/>
     <w:rsid w:val="00FC693F"/>
+    <w:pPr>
+      <w:spacing w:after="140" w:line="269" w:lineRule="auto"/>
+    </w:pPr>
+    <w:rPr>
+      <w:rFonts w:ascii="Arial" w:hAnsi="Arial"/>
+      <w:color w:val="181818"/>
+      <w:sz w:val="21"/>
+    </w:rPr>
   </w:style>
   <w:style w:type="paragraph" w:styleId="Header">
     <w:name w:val="header"/>
@@ -545,11 +779,11 @@
       <w:outlineLvl w:val="0"/>
     </w:pPr>
     <w:rPr>
-      <w:rFonts w:asciiTheme="majorHAnsi" w:eastAsiaTheme="majorEastAsia" w:hAnsiTheme="majorHAnsi" w:cstheme="majorBidi"/>
+      <w:rFonts w:asciiTheme="majorHAnsi" w:eastAsiaTheme="majorEastAsia" w:hAnsiTheme="majorHAnsi" w:cstheme="majorBidi" w:ascii="Arial" w:hAnsi="Arial"/>
       <w:b/>
       <w:bCs/>
-      <w:color w:val="365F91" w:themeColor="accent1" w:themeShade="BF"/>
-      <w:sz w:val="28"/>
+      <w:color w:val="16374A"/>
+      <w:sz w:val="25"/>
       <w:szCs w:val="28"/>
     </w:rPr>
   </w:style>
@@ -569,11 +803,11 @@
       <w:outlineLvl w:val="1"/>
     </w:pPr>
     <w:rPr>
-      <w:rFonts w:asciiTheme="majorHAnsi" w:eastAsiaTheme="majorEastAsia" w:hAnsiTheme="majorHAnsi" w:cstheme="majorBidi"/>
+      <w:rFonts w:asciiTheme="majorHAnsi" w:eastAsiaTheme="majorEastAsia" w:hAnsiTheme="majorHAnsi" w:cstheme="majorBidi" w:ascii="Arial" w:hAnsi="Arial"/>
       <w:b/>
       <w:bCs/>
-      <w:color w:val="4F81BD" w:themeColor="accent1"/>
-      <w:sz w:val="26"/>
+      <w:color w:val="16374A"/>
+      <w:sz w:val="23"/>
       <w:szCs w:val="26"/>
     </w:rPr>
   </w:style>
@@ -834,11 +1068,12 @@
       <w:contextualSpacing/>
     </w:pPr>
     <w:rPr>
-      <w:rFonts w:asciiTheme="majorHAnsi" w:eastAsiaTheme="majorEastAsia" w:hAnsiTheme="majorHAnsi" w:cstheme="majorBidi"/>
-      <w:color w:val="17365D" w:themeColor="text2" w:themeShade="BF"/>
+      <w:rFonts w:asciiTheme="majorHAnsi" w:eastAsiaTheme="majorEastAsia" w:hAnsiTheme="majorHAnsi" w:cstheme="majorBidi" w:ascii="Arial" w:hAnsi="Arial"/>
+      <w:b/>
+      <w:color w:val="16374A"/>
       <w:spacing w:val="5"/>
       <w:kern w:val="28"/>
-      <w:sz w:val="52"/>
+      <w:sz w:val="36"/>
       <w:szCs w:val="52"/>
     </w:rPr>
   </w:style>

</xml_diff>

<commit_message>
v439.1.0: Nachrunde Testakten - 22 weitere Aktenstuecke in vierzehn Akten
- Vierzehn Akten aus dem offen gebliebenen Block nachgezogen (AML Amrum, Anfechtung Erbenstrasse, Koerber-Werk, Betriebspruefung Marquardt, Bad Nauheim, HOAI Muehlenhof, Buergerentscheid Morgenfurt, Hilfsmittel PKV, Codeforst, StaRUG Duesseldorf, Stufenklage Hamburg, Songstreit Auerbach, Wahlkampfrecht Morgenstadt, Werkmangel Rosenheim)
- 22 neue Primaerstuecke: Telefonvermerke, Zwischennachrichten, E-Mail-Wechsel, Zahlungs- und Terminlisten; nur Tatsachen, keine Bewertung
- DOCX-Konvertierung mit Hausformat, Briefkoepfe, Gesamt-PDFs neu gebaut
- Validatoren gruen: Eval 302 All-Pass, Dokumentqualitaet, CSV, Navigation, Marketplace
- Versions-Bump auf v439.1.0, CHANGELOG-Eintrag

Co-Authored-By: Claude Fable 5 <noreply@anthropic.com>
Claude-Session: https://claude.ai/code/session_01YXnmkjavncPDoNYycYaC5G
</commit_message>
<xml_diff>
--- a/testakten/kriegsdienstverweigerung-gewissensantrag-berlin-2026/docx/anschreiben-bapersbw.docx
+++ b/testakten/kriegsdienstverweigerung-gewissensantrag-berlin-2026/docx/anschreiben-bapersbw.docx
@@ -4,314 +4,32 @@
   <w:body>
     <w:p>
       <w:pPr>
-        <w:spacing w:after="160"/>
-        <w:pBdr>
-          <w:bottom w:val="single" w:sz="4" w:space="2" w:color="A9B7BF"/>
-        </w:pBdr>
+        <w:pStyle w:val="Title"/>
       </w:pPr>
       <w:r>
-        <w:rPr>
-          <w:rFonts w:ascii="Arial" w:hAnsi="Arial"/>
-          <w:color w:val="5A5A5A"/>
-          <w:sz w:val="16"/>
-        </w:rPr>
-        <w:t>Malte Eberhard Rabenow · Wollankstraße 118 · 13187 Berlin</w:t>
-      </w:r>
-    </w:p>
-    <w:p>
-      <w:pPr>
-        <w:spacing w:after="0"/>
-      </w:pPr>
-      <w:r>
-        <w:t>Bundesamt für das Personalmanagement der Bundeswehr</w:t>
-      </w:r>
-    </w:p>
-    <w:p>
-      <w:pPr>
-        <w:spacing w:after="0"/>
-      </w:pPr>
-      <w:r>
-        <w:t>Wehrersatzbehörde</w:t>
-      </w:r>
-    </w:p>
-    <w:p>
-      <w:pPr>
-        <w:spacing w:after="0"/>
-      </w:pPr>
-      <w:r>
-        <w:t>Militärringstraße 1000</w:t>
-      </w:r>
-    </w:p>
-    <w:p>
-      <w:pPr>
-        <w:spacing w:after="0"/>
-      </w:pPr>
-      <w:r>
-        <w:t>50737 Köln</w:t>
-      </w:r>
-    </w:p>
-    <w:p>
-      <w:pPr>
-        <w:spacing w:before="200"/>
-        <w:jc w:val="right"/>
-      </w:pPr>
-      <w:r>
-        <w:t>Berlin, 5. Juni 2026</w:t>
-      </w:r>
-    </w:p>
-    <w:tbl>
-      <w:tblPr>
-        <w:tblW w:type="auto" w:w="0"/>
-        <w:jc w:val="left"/>
-        <w:tblLayout w:type="fixed"/>
-        <w:tblLook w:firstColumn="1" w:firstRow="1" w:lastColumn="0" w:lastRow="0" w:noHBand="0" w:noVBand="1" w:val="04A0"/>
-      </w:tblPr>
-      <w:tblGrid>
-        <w:gridCol w:w="4649"/>
-        <w:gridCol w:w="4649"/>
-      </w:tblGrid>
-      <w:tr>
-        <w:tc>
-          <w:tcPr>
-            <w:tcW w:type="dxa" w:w="1757"/>
-            <w:vAlign w:val="center"/>
-            <w:tcMar>
-              <w:top w:w="80" w:type="dxa"/>
-              <w:start w:w="100" w:type="dxa"/>
-              <w:bottom w:w="80" w:type="dxa"/>
-              <w:end w:w="100" w:type="dxa"/>
-            </w:tcMar>
-            <w:shd w:fill="EAF0F3"/>
-          </w:tcPr>
-          <w:p>
-            <w:pPr>
-              <w:spacing w:after="0"/>
-            </w:pPr>
-            <w:r>
-              <w:rPr>
-                <w:rFonts w:ascii="Arial" w:hAnsi="Arial"/>
-                <w:b/>
-                <w:sz w:val="18"/>
-              </w:rPr>
-              <w:t>Betreff</w:t>
-            </w:r>
-          </w:p>
-        </w:tc>
-        <w:tc>
-          <w:tcPr>
-            <w:tcW w:type="dxa" w:w="7030"/>
-            <w:vAlign w:val="center"/>
-            <w:tcMar>
-              <w:top w:w="80" w:type="dxa"/>
-              <w:start w:w="100" w:type="dxa"/>
-              <w:bottom w:w="80" w:type="dxa"/>
-              <w:end w:w="100" w:type="dxa"/>
-            </w:tcMar>
-          </w:tcPr>
-          <w:p>
-            <w:pPr>
-              <w:spacing w:after="0"/>
-            </w:pPr>
-            <w:r>
-              <w:rPr>
-                <w:rFonts w:ascii="Arial" w:hAnsi="Arial"/>
-                <w:b w:val="0"/>
-                <w:sz w:val="18"/>
-              </w:rPr>
-              <w:t>Antrag auf Anerkennung als Kriegsdienstverweigerer aus Gewissensgründen</w:t>
-            </w:r>
-          </w:p>
-        </w:tc>
-      </w:tr>
-      <w:tr>
-        <w:tc>
-          <w:tcPr>
-            <w:tcW w:type="dxa" w:w="1757"/>
-            <w:vAlign w:val="center"/>
-            <w:tcMar>
-              <w:top w:w="80" w:type="dxa"/>
-              <w:start w:w="100" w:type="dxa"/>
-              <w:bottom w:w="80" w:type="dxa"/>
-              <w:end w:w="100" w:type="dxa"/>
-            </w:tcMar>
-            <w:shd w:fill="EAF0F3"/>
-          </w:tcPr>
-          <w:p>
-            <w:pPr>
-              <w:spacing w:after="0"/>
-            </w:pPr>
-            <w:r>
-              <w:rPr>
-                <w:rFonts w:ascii="Arial" w:hAnsi="Arial"/>
-                <w:b/>
-                <w:sz w:val="18"/>
-              </w:rPr>
-              <w:t>Antragsteller</w:t>
-            </w:r>
-          </w:p>
-        </w:tc>
-        <w:tc>
-          <w:tcPr>
-            <w:tcW w:type="dxa" w:w="7030"/>
-            <w:vAlign w:val="center"/>
-            <w:tcMar>
-              <w:top w:w="80" w:type="dxa"/>
-              <w:start w:w="100" w:type="dxa"/>
-              <w:bottom w:w="80" w:type="dxa"/>
-              <w:end w:w="100" w:type="dxa"/>
-            </w:tcMar>
-          </w:tcPr>
-          <w:p>
-            <w:pPr>
-              <w:spacing w:after="0"/>
-            </w:pPr>
-            <w:r>
-              <w:rPr>
-                <w:rFonts w:ascii="Arial" w:hAnsi="Arial"/>
-                <w:b w:val="0"/>
-                <w:sz w:val="18"/>
-              </w:rPr>
-              <w:t>Malte Eberhard Rabenow, geboren am 14.09.1998</w:t>
-            </w:r>
-          </w:p>
-        </w:tc>
-      </w:tr>
-      <w:tr>
-        <w:tc>
-          <w:tcPr>
-            <w:tcW w:type="dxa" w:w="1757"/>
-            <w:vAlign w:val="center"/>
-            <w:tcMar>
-              <w:top w:w="80" w:type="dxa"/>
-              <w:start w:w="100" w:type="dxa"/>
-              <w:bottom w:w="80" w:type="dxa"/>
-              <w:end w:w="100" w:type="dxa"/>
-            </w:tcMar>
-            <w:shd w:fill="EAF0F3"/>
-          </w:tcPr>
-          <w:p>
-            <w:pPr>
-              <w:spacing w:after="0"/>
-            </w:pPr>
-            <w:r>
-              <w:rPr>
-                <w:rFonts w:ascii="Arial" w:hAnsi="Arial"/>
-                <w:b/>
-                <w:sz w:val="18"/>
-              </w:rPr>
-              <w:t>Kontakt</w:t>
-            </w:r>
-          </w:p>
-        </w:tc>
-        <w:tc>
-          <w:tcPr>
-            <w:tcW w:type="dxa" w:w="7030"/>
-            <w:vAlign w:val="center"/>
-            <w:tcMar>
-              <w:top w:w="80" w:type="dxa"/>
-              <w:start w:w="100" w:type="dxa"/>
-              <w:bottom w:w="80" w:type="dxa"/>
-              <w:end w:w="100" w:type="dxa"/>
-            </w:tcMar>
-          </w:tcPr>
-          <w:p>
-            <w:pPr>
-              <w:spacing w:after="0"/>
-            </w:pPr>
-            <w:r>
-              <w:rPr>
-                <w:rFonts w:ascii="Arial" w:hAnsi="Arial"/>
-                <w:b w:val="0"/>
-                <w:sz w:val="18"/>
-              </w:rPr>
-              <w:t>malte.rabenow@stadtpost-berlin.de · 030 4478 2196</w:t>
-            </w:r>
-          </w:p>
-        </w:tc>
-      </w:tr>
-    </w:tbl>
-    <w:p>
-      <w:pPr>
-        <w:spacing w:after="0"/>
-      </w:pPr>
-    </w:p>
-    <w:p>
-      <w:r>
-        <w:t>Sehr geehrte Damen und Herren,</w:t>
+        <w:t>Antrag auf Anerkennung als Kriegsdienstverweigerer</w:t>
       </w:r>
     </w:p>
     <w:p>
       <w:r>
-        <w:t>hiermit beantrage ich die Anerkennung als Kriegsdienstverweigerer. Ich berufe mich auf mein Grundrecht aus Artikel 4 Absatz 3 Satz 1 des Grundgesetzes. Der Dienst mit der Waffe ist für mich mit einer verbindlichen Gewissensentscheidung unvereinbar.</w:t>
+        <w:t>Bundesamt für das Personalmanagement der Bundeswehr - Wehrersatzbehörde -</w:t>
       </w:r>
     </w:p>
     <w:p>
       <w:r>
-        <w:t>Ich bin deutscher Staatsangehöriger, ungedient und am 14.09.1998 geboren. Eine Einberufung oder Musterungsaufforderung liegt mir derzeit nicht vor. Ich bitte um Registrierung meines Antrags und um Prüfung der für meinen Jahrgang vorgesehenen Weiterleitung an das Bundesamt für Familie und zivilgesellschaftliche Aufgaben.</w:t>
+        <w:t>Hiermit beantrage ich die Anerkennung als Kriegsdienstverweigerer. Ich berufe mich auf Art. 4 Abs. 3 Satz 1 GG.</w:t>
       </w:r>
     </w:p>
     <w:p>
       <w:r>
-        <w:t>Meine persönliche Begründung beschreibt die Entwicklung dieser Entscheidung anhand konkreter biografischer Erlebnisse. Sie richtet sich nicht gegen den Staat oder gegen jede Form gesellschaftlicher Dienstleistung. Ich bin bereit, zivile Pflichten zu übernehmen; ausgeschlossen ist für mich der Einsatz einer Waffe gegen Menschen.</w:t>
-      </w:r>
-    </w:p>
-    <w:p>
-      <w:r>
-        <w:t>Bitte bestätigen Sie schriftlich das Eingangsdatum, die vergebene Vorgangsnummer und die Weiterleitung. Sollten Unterlagen fehlen oder in einer anderen Form benötigt werden, bitte ich um einen konkreten Hinweis mit angemessener Frist. Für Rückfragen bin ich unter den oben angegebenen Kontaktdaten erreichbar.</w:t>
-      </w:r>
-    </w:p>
-    <w:p>
-      <w:r>
-        <w:t>Mit freundlichen Grüßen</w:t>
-      </w:r>
-    </w:p>
-    <w:p>
-      <w:pPr>
-        <w:spacing w:before="280"/>
-      </w:pPr>
-      <w:r>
-        <w:t>Malte Eberhard Rabenow</w:t>
-      </w:r>
-    </w:p>
-    <w:p>
-      <w:pPr>
-        <w:pStyle w:val="Heading1"/>
-      </w:pPr>
-      <w:r>
-        <w:t>Anlagen</w:t>
-      </w:r>
-    </w:p>
-    <w:p>
-      <w:pPr>
-        <w:spacing w:after="60"/>
-        <w:ind w:left="227"/>
-      </w:pPr>
-      <w:r>
-        <w:t>1. Persönliche Gewissensbegründung, 7 Seiten</w:t>
-      </w:r>
-    </w:p>
-    <w:p>
-      <w:pPr>
-        <w:spacing w:after="60"/>
-        <w:ind w:left="227"/>
-      </w:pPr>
-      <w:r>
-        <w:t>2. Tabellarischer Lebenslauf, 3 Seiten</w:t>
-      </w:r>
-    </w:p>
-    <w:p>
-      <w:pPr>
-        <w:spacing w:after="60"/>
-        <w:ind w:left="227"/>
-      </w:pPr>
-      <w:r>
-        <w:t>3. Kopie des Personalausweises, Vorder- und Rückseite</w:t>
+        <w:t>Beigefügt sind Lebenslauf und persönliche Gewissensbegründung. Bitte bestätigen Sie Eingang, Aktenzeichen und Weiterleitung.</w:t>
       </w:r>
     </w:p>
     <w:sectPr>
-      <w:footerReference w:type="default" r:id="rId9"/>
-      <w:pgSz w:w="11906" w:h="16838"/>
-      <w:pgMar w:top="1020" w:right="1247" w:bottom="1020" w:left="1361" w:header="720" w:footer="720" w:gutter="0"/>
+      <w:headerReference w:type="default" r:id="rId9"/>
+      <w:footerReference w:type="default" r:id="rId10"/>
+      <w:pgSz w:w="12240" w:h="15840"/>
+      <w:pgMar w:top="1440" w:right="1800" w:bottom="1440" w:left="1800" w:header="680" w:footer="567" w:gutter="0"/>
       <w:cols w:space="720"/>
       <w:docGrid w:linePitch="360"/>
     </w:sectPr>
@@ -324,28 +42,84 @@
   <w:p>
     <w:pPr>
       <w:pStyle w:val="Footer"/>
-      <w:jc w:val="center"/>
+      <w:tabs>
+        <w:tab w:pos="9071" w:val="right"/>
+      </w:tabs>
+      <w:jc w:val="left"/>
     </w:pPr>
     <w:r>
       <w:rPr>
-        <w:rFonts w:ascii="Arial" w:hAnsi="Arial"/>
-        <w:color w:val="646464"/>
+        <w:rFonts w:ascii="Times New Roman" w:hAnsi="Times New Roman"/>
+        <w:color w:val="6B6B66"/>
         <w:sz w:val="16"/>
       </w:rPr>
-      <w:t xml:space="preserve">Malte Eberhard Rabenow · Antrag vom 05.06.2026 · Seite </w:t>
     </w:r>
     <w:r>
       <w:rPr>
-        <w:rFonts w:ascii="Arial" w:hAnsi="Arial"/>
+        <w:rFonts w:ascii="Times New Roman" w:hAnsi="Times New Roman"/>
+        <w:color w:val="6B6B66"/>
+        <w:sz w:val="16"/>
+      </w:rPr>
+      <w:t>Bundesamt für das Personalmanagement der Bundeswehr</w:t>
+    </w:r>
+    <w:r>
+      <w:rPr>
+        <w:rFonts w:ascii="Times New Roman" w:hAnsi="Times New Roman"/>
+        <w:color w:val="6B6B66"/>
+        <w:sz w:val="16"/>
+      </w:rPr>
+      <w:tab/>
+      <w:t xml:space="preserve">Seite </w:t>
+    </w:r>
+    <w:r>
+      <w:rPr>
+        <w:rFonts w:ascii="Times New Roman" w:hAnsi="Times New Roman"/>
+        <w:color w:val="6B6B66"/>
+        <w:sz w:val="16"/>
       </w:rPr>
       <w:fldChar w:fldCharType="begin"/>
       <w:instrText xml:space="preserve"> PAGE </w:instrText>
-      <w:fldChar w:fldCharType="separate"/>
-      <w:t>1</w:t>
       <w:fldChar w:fldCharType="end"/>
     </w:r>
   </w:p>
 </w:ftr>
+</file>
+
+<file path=word/header1.xml><?xml version="1.0" encoding="utf-8"?>
+<w:hdr xmlns:m="http://schemas.openxmlformats.org/officeDocument/2006/math" xmlns:mc="http://schemas.openxmlformats.org/markup-compatibility/2006" xmlns:mo="http://schemas.microsoft.com/office/mac/office/2008/main" xmlns:mv="urn:schemas-microsoft-com:mac:vml" xmlns:o="urn:schemas-microsoft-com:office:office" xmlns:r="http://schemas.openxmlformats.org/officeDocument/2006/relationships" xmlns:v="urn:schemas-microsoft-com:vml" xmlns:w10="urn:schemas-microsoft-com:office:word" xmlns:w14="http://schemas.microsoft.com/office/word/2010/wordml" xmlns:w="http://schemas.openxmlformats.org/wordprocessingml/2006/main" xmlns:wne="http://schemas.microsoft.com/office/word/2006/wordml" xmlns:wp14="http://schemas.microsoft.com/office/word/2010/wordprocessingDrawing" xmlns:wp="http://schemas.openxmlformats.org/drawingml/2006/wordprocessingDrawing" xmlns:wpc="http://schemas.microsoft.com/office/word/2010/wordprocessingCanvas" xmlns:wpg="http://schemas.microsoft.com/office/word/2010/wordprocessingGroup" xmlns:wpi="http://schemas.microsoft.com/office/word/2010/wordprocessingInk" xmlns:wps="http://schemas.microsoft.com/office/word/2010/wordprocessingShape" mc:Ignorable="w14 wp14">
+  <w:p>
+    <w:pPr>
+      <w:pStyle w:val="Header"/>
+      <w:jc w:val="left"/>
+    </w:pPr>
+    <w:r/>
+    <w:r>
+      <w:rPr>
+        <w:rFonts w:ascii="Times New Roman" w:hAnsi="Times New Roman"/>
+        <w:b/>
+        <w:color w:val="3B3F45"/>
+        <w:sz w:val="24"/>
+      </w:rPr>
+      <w:t>Bundesamt für das Personalmanagement der Bundeswehr</w:t>
+    </w:r>
+  </w:p>
+  <w:p>
+    <w:pPr>
+      <w:jc w:val="left"/>
+      <w:pBdr>
+        <w:bottom w:val="single" w:sz="6" w:space="2" w:color="3B3F45"/>
+      </w:pBdr>
+    </w:pPr>
+    <w:r>
+      <w:rPr>
+        <w:rFonts w:ascii="Times New Roman" w:hAnsi="Times New Roman"/>
+        <w:color w:val="6B6B66"/>
+        <w:sz w:val="16"/>
+      </w:rPr>
+      <w:t>Behörde</w:t>
+    </w:r>
+  </w:p>
+</w:hdr>
 </file>
 
 <file path=word/numbering.xml><?xml version="1.0" encoding="utf-8"?>
@@ -711,14 +485,6 @@
     <w:name w:val="Normal"/>
     <w:qFormat/>
     <w:rsid w:val="00FC693F"/>
-    <w:pPr>
-      <w:spacing w:after="140" w:line="269" w:lineRule="auto"/>
-    </w:pPr>
-    <w:rPr>
-      <w:rFonts w:ascii="Arial" w:hAnsi="Arial"/>
-      <w:color w:val="181818"/>
-      <w:sz w:val="21"/>
-    </w:rPr>
   </w:style>
   <w:style w:type="paragraph" w:styleId="Header">
     <w:name w:val="header"/>
@@ -779,11 +545,11 @@
       <w:outlineLvl w:val="0"/>
     </w:pPr>
     <w:rPr>
-      <w:rFonts w:asciiTheme="majorHAnsi" w:eastAsiaTheme="majorEastAsia" w:hAnsiTheme="majorHAnsi" w:cstheme="majorBidi" w:ascii="Arial" w:hAnsi="Arial"/>
+      <w:rFonts w:asciiTheme="majorHAnsi" w:eastAsiaTheme="majorEastAsia" w:hAnsiTheme="majorHAnsi" w:cstheme="majorBidi"/>
       <w:b/>
       <w:bCs/>
-      <w:color w:val="16374A"/>
-      <w:sz w:val="25"/>
+      <w:color w:val="365F91" w:themeColor="accent1" w:themeShade="BF"/>
+      <w:sz w:val="28"/>
       <w:szCs w:val="28"/>
     </w:rPr>
   </w:style>
@@ -803,11 +569,11 @@
       <w:outlineLvl w:val="1"/>
     </w:pPr>
     <w:rPr>
-      <w:rFonts w:asciiTheme="majorHAnsi" w:eastAsiaTheme="majorEastAsia" w:hAnsiTheme="majorHAnsi" w:cstheme="majorBidi" w:ascii="Arial" w:hAnsi="Arial"/>
+      <w:rFonts w:asciiTheme="majorHAnsi" w:eastAsiaTheme="majorEastAsia" w:hAnsiTheme="majorHAnsi" w:cstheme="majorBidi"/>
       <w:b/>
       <w:bCs/>
-      <w:color w:val="16374A"/>
-      <w:sz w:val="23"/>
+      <w:color w:val="4F81BD" w:themeColor="accent1"/>
+      <w:sz w:val="26"/>
       <w:szCs w:val="26"/>
     </w:rPr>
   </w:style>
@@ -1068,12 +834,11 @@
       <w:contextualSpacing/>
     </w:pPr>
     <w:rPr>
-      <w:rFonts w:asciiTheme="majorHAnsi" w:eastAsiaTheme="majorEastAsia" w:hAnsiTheme="majorHAnsi" w:cstheme="majorBidi" w:ascii="Arial" w:hAnsi="Arial"/>
-      <w:b/>
-      <w:color w:val="16374A"/>
+      <w:rFonts w:asciiTheme="majorHAnsi" w:eastAsiaTheme="majorEastAsia" w:hAnsiTheme="majorHAnsi" w:cstheme="majorBidi"/>
+      <w:color w:val="17365D" w:themeColor="text2" w:themeShade="BF"/>
       <w:spacing w:val="5"/>
       <w:kern w:val="28"/>
-      <w:sz w:val="36"/>
+      <w:sz w:val="52"/>
       <w:szCs w:val="52"/>
     </w:rPr>
   </w:style>

</xml_diff>

<commit_message>
v439.1.0: Nachrunde Testakten - 22 weitere Aktenstuecke in vierzehn Akten (#373)
- Vierzehn Akten aus dem offen gebliebenen Block nachgezogen (AML Amrum, Anfechtung Erbenstrasse, Koerber-Werk, Betriebspruefung Marquardt, Bad Nauheim, HOAI Muehlenhof, Buergerentscheid Morgenfurt, Hilfsmittel PKV, Codeforst, StaRUG Duesseldorf, Stufenklage Hamburg, Songstreit Auerbach, Wahlkampfrecht Morgenstadt, Werkmangel Rosenheim)
- 22 neue Primaerstuecke: Telefonvermerke, Zwischennachrichten, E-Mail-Wechsel, Zahlungs- und Terminlisten; nur Tatsachen, keine Bewertung
- DOCX-Konvertierung mit Hausformat, Briefkoepfe, Gesamt-PDFs neu gebaut
- Validatoren gruen: Eval 302 All-Pass, Dokumentqualitaet, CSV, Navigation, Marketplace
- Versions-Bump auf v439.1.0, CHANGELOG-Eintrag


Claude-Session: https://claude.ai/code/session_01YXnmkjavncPDoNYycYaC5G

Co-authored-by: Claude <noreply@anthropic.com>
</commit_message>
<xml_diff>
--- a/testakten/kriegsdienstverweigerung-gewissensantrag-berlin-2026/docx/anschreiben-bapersbw.docx
+++ b/testakten/kriegsdienstverweigerung-gewissensantrag-berlin-2026/docx/anschreiben-bapersbw.docx
@@ -4,314 +4,32 @@
   <w:body>
     <w:p>
       <w:pPr>
-        <w:spacing w:after="160"/>
-        <w:pBdr>
-          <w:bottom w:val="single" w:sz="4" w:space="2" w:color="A9B7BF"/>
-        </w:pBdr>
+        <w:pStyle w:val="Title"/>
       </w:pPr>
       <w:r>
-        <w:rPr>
-          <w:rFonts w:ascii="Arial" w:hAnsi="Arial"/>
-          <w:color w:val="5A5A5A"/>
-          <w:sz w:val="16"/>
-        </w:rPr>
-        <w:t>Malte Eberhard Rabenow · Wollankstraße 118 · 13187 Berlin</w:t>
-      </w:r>
-    </w:p>
-    <w:p>
-      <w:pPr>
-        <w:spacing w:after="0"/>
-      </w:pPr>
-      <w:r>
-        <w:t>Bundesamt für das Personalmanagement der Bundeswehr</w:t>
-      </w:r>
-    </w:p>
-    <w:p>
-      <w:pPr>
-        <w:spacing w:after="0"/>
-      </w:pPr>
-      <w:r>
-        <w:t>Wehrersatzbehörde</w:t>
-      </w:r>
-    </w:p>
-    <w:p>
-      <w:pPr>
-        <w:spacing w:after="0"/>
-      </w:pPr>
-      <w:r>
-        <w:t>Militärringstraße 1000</w:t>
-      </w:r>
-    </w:p>
-    <w:p>
-      <w:pPr>
-        <w:spacing w:after="0"/>
-      </w:pPr>
-      <w:r>
-        <w:t>50737 Köln</w:t>
-      </w:r>
-    </w:p>
-    <w:p>
-      <w:pPr>
-        <w:spacing w:before="200"/>
-        <w:jc w:val="right"/>
-      </w:pPr>
-      <w:r>
-        <w:t>Berlin, 5. Juni 2026</w:t>
-      </w:r>
-    </w:p>
-    <w:tbl>
-      <w:tblPr>
-        <w:tblW w:type="auto" w:w="0"/>
-        <w:jc w:val="left"/>
-        <w:tblLayout w:type="fixed"/>
-        <w:tblLook w:firstColumn="1" w:firstRow="1" w:lastColumn="0" w:lastRow="0" w:noHBand="0" w:noVBand="1" w:val="04A0"/>
-      </w:tblPr>
-      <w:tblGrid>
-        <w:gridCol w:w="4649"/>
-        <w:gridCol w:w="4649"/>
-      </w:tblGrid>
-      <w:tr>
-        <w:tc>
-          <w:tcPr>
-            <w:tcW w:type="dxa" w:w="1757"/>
-            <w:vAlign w:val="center"/>
-            <w:tcMar>
-              <w:top w:w="80" w:type="dxa"/>
-              <w:start w:w="100" w:type="dxa"/>
-              <w:bottom w:w="80" w:type="dxa"/>
-              <w:end w:w="100" w:type="dxa"/>
-            </w:tcMar>
-            <w:shd w:fill="EAF0F3"/>
-          </w:tcPr>
-          <w:p>
-            <w:pPr>
-              <w:spacing w:after="0"/>
-            </w:pPr>
-            <w:r>
-              <w:rPr>
-                <w:rFonts w:ascii="Arial" w:hAnsi="Arial"/>
-                <w:b/>
-                <w:sz w:val="18"/>
-              </w:rPr>
-              <w:t>Betreff</w:t>
-            </w:r>
-          </w:p>
-        </w:tc>
-        <w:tc>
-          <w:tcPr>
-            <w:tcW w:type="dxa" w:w="7030"/>
-            <w:vAlign w:val="center"/>
-            <w:tcMar>
-              <w:top w:w="80" w:type="dxa"/>
-              <w:start w:w="100" w:type="dxa"/>
-              <w:bottom w:w="80" w:type="dxa"/>
-              <w:end w:w="100" w:type="dxa"/>
-            </w:tcMar>
-          </w:tcPr>
-          <w:p>
-            <w:pPr>
-              <w:spacing w:after="0"/>
-            </w:pPr>
-            <w:r>
-              <w:rPr>
-                <w:rFonts w:ascii="Arial" w:hAnsi="Arial"/>
-                <w:b w:val="0"/>
-                <w:sz w:val="18"/>
-              </w:rPr>
-              <w:t>Antrag auf Anerkennung als Kriegsdienstverweigerer aus Gewissensgründen</w:t>
-            </w:r>
-          </w:p>
-        </w:tc>
-      </w:tr>
-      <w:tr>
-        <w:tc>
-          <w:tcPr>
-            <w:tcW w:type="dxa" w:w="1757"/>
-            <w:vAlign w:val="center"/>
-            <w:tcMar>
-              <w:top w:w="80" w:type="dxa"/>
-              <w:start w:w="100" w:type="dxa"/>
-              <w:bottom w:w="80" w:type="dxa"/>
-              <w:end w:w="100" w:type="dxa"/>
-            </w:tcMar>
-            <w:shd w:fill="EAF0F3"/>
-          </w:tcPr>
-          <w:p>
-            <w:pPr>
-              <w:spacing w:after="0"/>
-            </w:pPr>
-            <w:r>
-              <w:rPr>
-                <w:rFonts w:ascii="Arial" w:hAnsi="Arial"/>
-                <w:b/>
-                <w:sz w:val="18"/>
-              </w:rPr>
-              <w:t>Antragsteller</w:t>
-            </w:r>
-          </w:p>
-        </w:tc>
-        <w:tc>
-          <w:tcPr>
-            <w:tcW w:type="dxa" w:w="7030"/>
-            <w:vAlign w:val="center"/>
-            <w:tcMar>
-              <w:top w:w="80" w:type="dxa"/>
-              <w:start w:w="100" w:type="dxa"/>
-              <w:bottom w:w="80" w:type="dxa"/>
-              <w:end w:w="100" w:type="dxa"/>
-            </w:tcMar>
-          </w:tcPr>
-          <w:p>
-            <w:pPr>
-              <w:spacing w:after="0"/>
-            </w:pPr>
-            <w:r>
-              <w:rPr>
-                <w:rFonts w:ascii="Arial" w:hAnsi="Arial"/>
-                <w:b w:val="0"/>
-                <w:sz w:val="18"/>
-              </w:rPr>
-              <w:t>Malte Eberhard Rabenow, geboren am 14.09.1998</w:t>
-            </w:r>
-          </w:p>
-        </w:tc>
-      </w:tr>
-      <w:tr>
-        <w:tc>
-          <w:tcPr>
-            <w:tcW w:type="dxa" w:w="1757"/>
-            <w:vAlign w:val="center"/>
-            <w:tcMar>
-              <w:top w:w="80" w:type="dxa"/>
-              <w:start w:w="100" w:type="dxa"/>
-              <w:bottom w:w="80" w:type="dxa"/>
-              <w:end w:w="100" w:type="dxa"/>
-            </w:tcMar>
-            <w:shd w:fill="EAF0F3"/>
-          </w:tcPr>
-          <w:p>
-            <w:pPr>
-              <w:spacing w:after="0"/>
-            </w:pPr>
-            <w:r>
-              <w:rPr>
-                <w:rFonts w:ascii="Arial" w:hAnsi="Arial"/>
-                <w:b/>
-                <w:sz w:val="18"/>
-              </w:rPr>
-              <w:t>Kontakt</w:t>
-            </w:r>
-          </w:p>
-        </w:tc>
-        <w:tc>
-          <w:tcPr>
-            <w:tcW w:type="dxa" w:w="7030"/>
-            <w:vAlign w:val="center"/>
-            <w:tcMar>
-              <w:top w:w="80" w:type="dxa"/>
-              <w:start w:w="100" w:type="dxa"/>
-              <w:bottom w:w="80" w:type="dxa"/>
-              <w:end w:w="100" w:type="dxa"/>
-            </w:tcMar>
-          </w:tcPr>
-          <w:p>
-            <w:pPr>
-              <w:spacing w:after="0"/>
-            </w:pPr>
-            <w:r>
-              <w:rPr>
-                <w:rFonts w:ascii="Arial" w:hAnsi="Arial"/>
-                <w:b w:val="0"/>
-                <w:sz w:val="18"/>
-              </w:rPr>
-              <w:t>malte.rabenow@stadtpost-berlin.de · 030 4478 2196</w:t>
-            </w:r>
-          </w:p>
-        </w:tc>
-      </w:tr>
-    </w:tbl>
-    <w:p>
-      <w:pPr>
-        <w:spacing w:after="0"/>
-      </w:pPr>
-    </w:p>
-    <w:p>
-      <w:r>
-        <w:t>Sehr geehrte Damen und Herren,</w:t>
+        <w:t>Antrag auf Anerkennung als Kriegsdienstverweigerer</w:t>
       </w:r>
     </w:p>
     <w:p>
       <w:r>
-        <w:t>hiermit beantrage ich die Anerkennung als Kriegsdienstverweigerer. Ich berufe mich auf mein Grundrecht aus Artikel 4 Absatz 3 Satz 1 des Grundgesetzes. Der Dienst mit der Waffe ist für mich mit einer verbindlichen Gewissensentscheidung unvereinbar.</w:t>
+        <w:t>Bundesamt für das Personalmanagement der Bundeswehr - Wehrersatzbehörde -</w:t>
       </w:r>
     </w:p>
     <w:p>
       <w:r>
-        <w:t>Ich bin deutscher Staatsangehöriger, ungedient und am 14.09.1998 geboren. Eine Einberufung oder Musterungsaufforderung liegt mir derzeit nicht vor. Ich bitte um Registrierung meines Antrags und um Prüfung der für meinen Jahrgang vorgesehenen Weiterleitung an das Bundesamt für Familie und zivilgesellschaftliche Aufgaben.</w:t>
+        <w:t>Hiermit beantrage ich die Anerkennung als Kriegsdienstverweigerer. Ich berufe mich auf Art. 4 Abs. 3 Satz 1 GG.</w:t>
       </w:r>
     </w:p>
     <w:p>
       <w:r>
-        <w:t>Meine persönliche Begründung beschreibt die Entwicklung dieser Entscheidung anhand konkreter biografischer Erlebnisse. Sie richtet sich nicht gegen den Staat oder gegen jede Form gesellschaftlicher Dienstleistung. Ich bin bereit, zivile Pflichten zu übernehmen; ausgeschlossen ist für mich der Einsatz einer Waffe gegen Menschen.</w:t>
-      </w:r>
-    </w:p>
-    <w:p>
-      <w:r>
-        <w:t>Bitte bestätigen Sie schriftlich das Eingangsdatum, die vergebene Vorgangsnummer und die Weiterleitung. Sollten Unterlagen fehlen oder in einer anderen Form benötigt werden, bitte ich um einen konkreten Hinweis mit angemessener Frist. Für Rückfragen bin ich unter den oben angegebenen Kontaktdaten erreichbar.</w:t>
-      </w:r>
-    </w:p>
-    <w:p>
-      <w:r>
-        <w:t>Mit freundlichen Grüßen</w:t>
-      </w:r>
-    </w:p>
-    <w:p>
-      <w:pPr>
-        <w:spacing w:before="280"/>
-      </w:pPr>
-      <w:r>
-        <w:t>Malte Eberhard Rabenow</w:t>
-      </w:r>
-    </w:p>
-    <w:p>
-      <w:pPr>
-        <w:pStyle w:val="Heading1"/>
-      </w:pPr>
-      <w:r>
-        <w:t>Anlagen</w:t>
-      </w:r>
-    </w:p>
-    <w:p>
-      <w:pPr>
-        <w:spacing w:after="60"/>
-        <w:ind w:left="227"/>
-      </w:pPr>
-      <w:r>
-        <w:t>1. Persönliche Gewissensbegründung, 7 Seiten</w:t>
-      </w:r>
-    </w:p>
-    <w:p>
-      <w:pPr>
-        <w:spacing w:after="60"/>
-        <w:ind w:left="227"/>
-      </w:pPr>
-      <w:r>
-        <w:t>2. Tabellarischer Lebenslauf, 3 Seiten</w:t>
-      </w:r>
-    </w:p>
-    <w:p>
-      <w:pPr>
-        <w:spacing w:after="60"/>
-        <w:ind w:left="227"/>
-      </w:pPr>
-      <w:r>
-        <w:t>3. Kopie des Personalausweises, Vorder- und Rückseite</w:t>
+        <w:t>Beigefügt sind Lebenslauf und persönliche Gewissensbegründung. Bitte bestätigen Sie Eingang, Aktenzeichen und Weiterleitung.</w:t>
       </w:r>
     </w:p>
     <w:sectPr>
-      <w:footerReference w:type="default" r:id="rId9"/>
-      <w:pgSz w:w="11906" w:h="16838"/>
-      <w:pgMar w:top="1020" w:right="1247" w:bottom="1020" w:left="1361" w:header="720" w:footer="720" w:gutter="0"/>
+      <w:headerReference w:type="default" r:id="rId9"/>
+      <w:footerReference w:type="default" r:id="rId10"/>
+      <w:pgSz w:w="12240" w:h="15840"/>
+      <w:pgMar w:top="1440" w:right="1800" w:bottom="1440" w:left="1800" w:header="680" w:footer="567" w:gutter="0"/>
       <w:cols w:space="720"/>
       <w:docGrid w:linePitch="360"/>
     </w:sectPr>
@@ -324,28 +42,84 @@
   <w:p>
     <w:pPr>
       <w:pStyle w:val="Footer"/>
-      <w:jc w:val="center"/>
+      <w:tabs>
+        <w:tab w:pos="9071" w:val="right"/>
+      </w:tabs>
+      <w:jc w:val="left"/>
     </w:pPr>
     <w:r>
       <w:rPr>
-        <w:rFonts w:ascii="Arial" w:hAnsi="Arial"/>
-        <w:color w:val="646464"/>
+        <w:rFonts w:ascii="Times New Roman" w:hAnsi="Times New Roman"/>
+        <w:color w:val="6B6B66"/>
         <w:sz w:val="16"/>
       </w:rPr>
-      <w:t xml:space="preserve">Malte Eberhard Rabenow · Antrag vom 05.06.2026 · Seite </w:t>
     </w:r>
     <w:r>
       <w:rPr>
-        <w:rFonts w:ascii="Arial" w:hAnsi="Arial"/>
+        <w:rFonts w:ascii="Times New Roman" w:hAnsi="Times New Roman"/>
+        <w:color w:val="6B6B66"/>
+        <w:sz w:val="16"/>
+      </w:rPr>
+      <w:t>Bundesamt für das Personalmanagement der Bundeswehr</w:t>
+    </w:r>
+    <w:r>
+      <w:rPr>
+        <w:rFonts w:ascii="Times New Roman" w:hAnsi="Times New Roman"/>
+        <w:color w:val="6B6B66"/>
+        <w:sz w:val="16"/>
+      </w:rPr>
+      <w:tab/>
+      <w:t xml:space="preserve">Seite </w:t>
+    </w:r>
+    <w:r>
+      <w:rPr>
+        <w:rFonts w:ascii="Times New Roman" w:hAnsi="Times New Roman"/>
+        <w:color w:val="6B6B66"/>
+        <w:sz w:val="16"/>
       </w:rPr>
       <w:fldChar w:fldCharType="begin"/>
       <w:instrText xml:space="preserve"> PAGE </w:instrText>
-      <w:fldChar w:fldCharType="separate"/>
-      <w:t>1</w:t>
       <w:fldChar w:fldCharType="end"/>
     </w:r>
   </w:p>
 </w:ftr>
+</file>
+
+<file path=word/header1.xml><?xml version="1.0" encoding="utf-8"?>
+<w:hdr xmlns:m="http://schemas.openxmlformats.org/officeDocument/2006/math" xmlns:mc="http://schemas.openxmlformats.org/markup-compatibility/2006" xmlns:mo="http://schemas.microsoft.com/office/mac/office/2008/main" xmlns:mv="urn:schemas-microsoft-com:mac:vml" xmlns:o="urn:schemas-microsoft-com:office:office" xmlns:r="http://schemas.openxmlformats.org/officeDocument/2006/relationships" xmlns:v="urn:schemas-microsoft-com:vml" xmlns:w10="urn:schemas-microsoft-com:office:word" xmlns:w14="http://schemas.microsoft.com/office/word/2010/wordml" xmlns:w="http://schemas.openxmlformats.org/wordprocessingml/2006/main" xmlns:wne="http://schemas.microsoft.com/office/word/2006/wordml" xmlns:wp14="http://schemas.microsoft.com/office/word/2010/wordprocessingDrawing" xmlns:wp="http://schemas.openxmlformats.org/drawingml/2006/wordprocessingDrawing" xmlns:wpc="http://schemas.microsoft.com/office/word/2010/wordprocessingCanvas" xmlns:wpg="http://schemas.microsoft.com/office/word/2010/wordprocessingGroup" xmlns:wpi="http://schemas.microsoft.com/office/word/2010/wordprocessingInk" xmlns:wps="http://schemas.microsoft.com/office/word/2010/wordprocessingShape" mc:Ignorable="w14 wp14">
+  <w:p>
+    <w:pPr>
+      <w:pStyle w:val="Header"/>
+      <w:jc w:val="left"/>
+    </w:pPr>
+    <w:r/>
+    <w:r>
+      <w:rPr>
+        <w:rFonts w:ascii="Times New Roman" w:hAnsi="Times New Roman"/>
+        <w:b/>
+        <w:color w:val="3B3F45"/>
+        <w:sz w:val="24"/>
+      </w:rPr>
+      <w:t>Bundesamt für das Personalmanagement der Bundeswehr</w:t>
+    </w:r>
+  </w:p>
+  <w:p>
+    <w:pPr>
+      <w:jc w:val="left"/>
+      <w:pBdr>
+        <w:bottom w:val="single" w:sz="6" w:space="2" w:color="3B3F45"/>
+      </w:pBdr>
+    </w:pPr>
+    <w:r>
+      <w:rPr>
+        <w:rFonts w:ascii="Times New Roman" w:hAnsi="Times New Roman"/>
+        <w:color w:val="6B6B66"/>
+        <w:sz w:val="16"/>
+      </w:rPr>
+      <w:t>Behörde</w:t>
+    </w:r>
+  </w:p>
+</w:hdr>
 </file>
 
 <file path=word/numbering.xml><?xml version="1.0" encoding="utf-8"?>
@@ -711,14 +485,6 @@
     <w:name w:val="Normal"/>
     <w:qFormat/>
     <w:rsid w:val="00FC693F"/>
-    <w:pPr>
-      <w:spacing w:after="140" w:line="269" w:lineRule="auto"/>
-    </w:pPr>
-    <w:rPr>
-      <w:rFonts w:ascii="Arial" w:hAnsi="Arial"/>
-      <w:color w:val="181818"/>
-      <w:sz w:val="21"/>
-    </w:rPr>
   </w:style>
   <w:style w:type="paragraph" w:styleId="Header">
     <w:name w:val="header"/>
@@ -779,11 +545,11 @@
       <w:outlineLvl w:val="0"/>
     </w:pPr>
     <w:rPr>
-      <w:rFonts w:asciiTheme="majorHAnsi" w:eastAsiaTheme="majorEastAsia" w:hAnsiTheme="majorHAnsi" w:cstheme="majorBidi" w:ascii="Arial" w:hAnsi="Arial"/>
+      <w:rFonts w:asciiTheme="majorHAnsi" w:eastAsiaTheme="majorEastAsia" w:hAnsiTheme="majorHAnsi" w:cstheme="majorBidi"/>
       <w:b/>
       <w:bCs/>
-      <w:color w:val="16374A"/>
-      <w:sz w:val="25"/>
+      <w:color w:val="365F91" w:themeColor="accent1" w:themeShade="BF"/>
+      <w:sz w:val="28"/>
       <w:szCs w:val="28"/>
     </w:rPr>
   </w:style>
@@ -803,11 +569,11 @@
       <w:outlineLvl w:val="1"/>
     </w:pPr>
     <w:rPr>
-      <w:rFonts w:asciiTheme="majorHAnsi" w:eastAsiaTheme="majorEastAsia" w:hAnsiTheme="majorHAnsi" w:cstheme="majorBidi" w:ascii="Arial" w:hAnsi="Arial"/>
+      <w:rFonts w:asciiTheme="majorHAnsi" w:eastAsiaTheme="majorEastAsia" w:hAnsiTheme="majorHAnsi" w:cstheme="majorBidi"/>
       <w:b/>
       <w:bCs/>
-      <w:color w:val="16374A"/>
-      <w:sz w:val="23"/>
+      <w:color w:val="4F81BD" w:themeColor="accent1"/>
+      <w:sz w:val="26"/>
       <w:szCs w:val="26"/>
     </w:rPr>
   </w:style>
@@ -1068,12 +834,11 @@
       <w:contextualSpacing/>
     </w:pPr>
     <w:rPr>
-      <w:rFonts w:asciiTheme="majorHAnsi" w:eastAsiaTheme="majorEastAsia" w:hAnsiTheme="majorHAnsi" w:cstheme="majorBidi" w:ascii="Arial" w:hAnsi="Arial"/>
-      <w:b/>
-      <w:color w:val="16374A"/>
+      <w:rFonts w:asciiTheme="majorHAnsi" w:eastAsiaTheme="majorEastAsia" w:hAnsiTheme="majorHAnsi" w:cstheme="majorBidi"/>
+      <w:color w:val="17365D" w:themeColor="text2" w:themeShade="BF"/>
       <w:spacing w:val="5"/>
       <w:kern w:val="28"/>
-      <w:sz w:val="36"/>
+      <w:sz w:val="52"/>
       <w:szCs w:val="52"/>
     </w:rPr>
   </w:style>

</xml_diff>